<commit_message>
Audit fixes: character limits article
Co-Authored-By: Claude Opus 5.5 <noreply@anthropic.com>
Claude-Session: https://claude.ai/code/session_01GQXcnZLn4f9MkUS7SEqp5J
</commit_message>
<xml_diff>
--- a/blog-content/Social-Media-Character-Limits.docx
+++ b/blog-content/Social-Media-Character-Limits.docx
@@ -153,7 +153,7 @@
         </w:rPr>
         <w:t xml:space="preserve">This page lists the current limit for each field a business uses, with a link to the platform's own help page wherever one exists. Where a number comes only from third-party sources, we say so. Limits checked on 14 October 2026. For the strategy behind your posts, see our </w:t>
       </w:r>
-      <w:hyperlink w:history="1" r:id="rId6uo45ifuy5qoxgqggytmq">
+      <w:hyperlink w:history="1" r:id="rIdh4cila9ain_fa2npyrvan">
         <w:r>
           <w:rPr>
             <w:rStyle w:val="Hyperlink"/>
@@ -1001,7 +1001,7 @@
         </w:rPr>
         <w:t xml:space="preserve">X doesn't count every character the same way. According to </w:t>
       </w:r>
-      <w:hyperlink w:history="1" r:id="rIdsqahnvqulrrubgfqsg3b4">
+      <w:hyperlink w:history="1" r:id="rIdd_f9lq3t2bgsnxi-fdwoo">
         <w:r>
           <w:rPr>
             <w:rStyle w:val="Hyperlink"/>
@@ -1124,51 +1124,6 @@
     </w:p>
     <w:p>
       <w:pPr>
-        <w:pStyle w:val="Heading2"/>
-        <w:spacing w:after="120" w:before="300"/>
-      </w:pPr>
-      <w:r>
-        <w:rPr>
-          <w:rFonts w:ascii="Calibri" w:cs="Calibri" w:eastAsia="Calibri" w:hAnsi="Calibri"/>
-          <w:b/>
-          <w:bCs/>
-          <w:color w:val="7C3AED"/>
-          <w:sz w:val="36"/>
-          <w:szCs w:val="36"/>
-        </w:rPr>
-        <w:t xml:space="preserve">What is the Instagram character limit?</w:t>
-      </w:r>
-    </w:p>
-    <w:p>
-      <w:pPr>
-        <w:spacing w:after="160"/>
-      </w:pPr>
-      <w:r>
-        <w:rPr>
-          <w:rFonts w:ascii="Calibri" w:cs="Calibri" w:eastAsia="Calibri" w:hAnsi="Calibri"/>
-          <w:color w:val="333333"/>
-          <w:sz w:val="24"/>
-          <w:szCs w:val="24"/>
-        </w:rPr>
-        <w:t xml:space="preserve">An Instagram caption can be up to 2,200 characters, and a bio up to 150. Since December 2025 a post or Reel can also carry no more than five hashtags, and the hashtags count towards the 2,200.</w:t>
-      </w:r>
-    </w:p>
-    <w:p>
-      <w:pPr>
-        <w:spacing w:after="160"/>
-      </w:pPr>
-      <w:r>
-        <w:rPr>
-          <w:rFonts w:ascii="Calibri" w:cs="Calibri" w:eastAsia="Calibri" w:hAnsi="Calibri"/>
-          <w:color w:val="333333"/>
-          <w:sz w:val="24"/>
-          <w:szCs w:val="24"/>
-        </w:rPr>
-        <w:t xml:space="preserve">Each of these has its own guide on BrightlyFuture:</w:t>
-      </w:r>
-    </w:p>
-    <w:p>
-      <w:pPr>
         <w:pStyle w:val="ListParagraph"/>
         <w:numPr>
           <w:ilvl w:val="0"/>
@@ -1184,6 +1139,80 @@
           <w:sz w:val="24"/>
           <w:szCs w:val="24"/>
         </w:rPr>
+        <w:t xml:space="preserve">@mentions added automatically at the start of a reply don't count</w:t>
+      </w:r>
+      <w:r>
+        <w:rPr>
+          <w:rFonts w:ascii="Calibri" w:cs="Calibri" w:eastAsia="Calibri" w:hAnsi="Calibri"/>
+          <w:color w:val="333333"/>
+          <w:sz w:val="24"/>
+          <w:szCs w:val="24"/>
+        </w:rPr>
+        <w:t xml:space="preserve">; ones you type yourself do.</w:t>
+      </w:r>
+    </w:p>
+    <w:p>
+      <w:pPr>
+        <w:pStyle w:val="Heading2"/>
+        <w:spacing w:after="120" w:before="300"/>
+      </w:pPr>
+      <w:r>
+        <w:rPr>
+          <w:rFonts w:ascii="Calibri" w:cs="Calibri" w:eastAsia="Calibri" w:hAnsi="Calibri"/>
+          <w:b/>
+          <w:bCs/>
+          <w:color w:val="7C3AED"/>
+          <w:sz w:val="36"/>
+          <w:szCs w:val="36"/>
+        </w:rPr>
+        <w:t xml:space="preserve">What is the Instagram character limit?</w:t>
+      </w:r>
+    </w:p>
+    <w:p>
+      <w:pPr>
+        <w:spacing w:after="160"/>
+      </w:pPr>
+      <w:r>
+        <w:rPr>
+          <w:rFonts w:ascii="Calibri" w:cs="Calibri" w:eastAsia="Calibri" w:hAnsi="Calibri"/>
+          <w:color w:val="333333"/>
+          <w:sz w:val="24"/>
+          <w:szCs w:val="24"/>
+        </w:rPr>
+        <w:t xml:space="preserve">An Instagram caption can be up to 2,200 characters, and a bio up to 150. Since December 2025 a post or Reel can also carry no more than five hashtags.</w:t>
+      </w:r>
+    </w:p>
+    <w:p>
+      <w:pPr>
+        <w:spacing w:after="160"/>
+      </w:pPr>
+      <w:r>
+        <w:rPr>
+          <w:rFonts w:ascii="Calibri" w:cs="Calibri" w:eastAsia="Calibri" w:hAnsi="Calibri"/>
+          <w:color w:val="333333"/>
+          <w:sz w:val="24"/>
+          <w:szCs w:val="24"/>
+        </w:rPr>
+        <w:t xml:space="preserve">Each of these has its own guide on BrightlyFuture:</w:t>
+      </w:r>
+    </w:p>
+    <w:p>
+      <w:pPr>
+        <w:pStyle w:val="ListParagraph"/>
+        <w:numPr>
+          <w:ilvl w:val="0"/>
+          <w:numId w:val="1"/>
+        </w:numPr>
+      </w:pPr>
+      <w:r>
+        <w:rPr>
+          <w:rFonts w:ascii="Calibri" w:cs="Calibri" w:eastAsia="Calibri" w:hAnsi="Calibri"/>
+          <w:b/>
+          <w:bCs/>
+          <w:color w:val="333333"/>
+          <w:sz w:val="24"/>
+          <w:szCs w:val="24"/>
+        </w:rPr>
         <w:t xml:space="preserve">Captions:</w:t>
       </w:r>
       <w:r>
@@ -1195,7 +1224,7 @@
         </w:rPr>
         <w:t xml:space="preserve"> how to use the space, from the first line to the call to action, in our guide to </w:t>
       </w:r>
-      <w:hyperlink w:history="1" r:id="rIdxea15ndzvlaozl2rwh1gl">
+      <w:hyperlink w:history="1" r:id="rIdv0sm2e6gzx7d0txrgwrlw">
         <w:r>
           <w:rPr>
             <w:rStyle w:val="Hyperlink"/>
@@ -1246,7 +1275,7 @@
         </w:rPr>
         <w:t xml:space="preserve"> what to fit into 150 characters, with 18 examples, in </w:t>
       </w:r>
-      <w:hyperlink w:history="1" r:id="rIdscbazuos27qmarcvrpzww">
+      <w:hyperlink w:history="1" r:id="rIdxc6axmessmwsulxe-wy5j">
         <w:r>
           <w:rPr>
             <w:rStyle w:val="Hyperlink"/>
@@ -1297,7 +1326,7 @@
         </w:rPr>
         <w:t xml:space="preserve"> how to choose the five, in our </w:t>
       </w:r>
-      <w:hyperlink w:history="1" r:id="rIdft4htxhes3jkb1ffeefjb">
+      <w:hyperlink w:history="1" r:id="rIdztrb-clz1j9aypj9vndk6">
         <w:r>
           <w:rPr>
             <w:rStyle w:val="Hyperlink"/>
@@ -1350,7 +1379,7 @@
         </w:rPr>
         <w:t xml:space="preserve">TikTok's app accepts captions of up to 4,000 characters, according to most 2026 sources, though TikTok hasn't published that number on a help page we could find. If you post through a scheduling tool, the limit is 2,200: that's the maximum in </w:t>
       </w:r>
-      <w:hyperlink w:history="1" r:id="rIduzkks1_jjnfcls8shew_v">
+      <w:hyperlink w:history="1" r:id="rIddpzhtwmdxkpuhugi301pt">
         <w:r>
           <w:rPr>
             <w:rStyle w:val="Hyperlink"/>
@@ -1417,7 +1446,7 @@
         </w:rPr>
         <w:t xml:space="preserve">A LinkedIn post can be up to 3,000 characters. For anything longer, </w:t>
       </w:r>
-      <w:hyperlink w:history="1" r:id="rIdsv7hxzako2cybeozugljb">
+      <w:hyperlink w:history="1" r:id="rIds_17j-060vzp2nr3oiniu">
         <w:r>
           <w:rPr>
             <w:rStyle w:val="Hyperlink"/>
@@ -1484,7 +1513,7 @@
         </w:rPr>
         <w:t xml:space="preserve">A YouTube video title can be up to 100 characters and a description up to 5,000, as </w:t>
       </w:r>
-      <w:hyperlink w:history="1" r:id="rIdk7sifjlryjr90bkfd0cvk">
+      <w:hyperlink w:history="1" r:id="rIdxclw1k9_eklsf_81esc1r">
         <w:r>
           <w:rPr>
             <w:rStyle w:val="Hyperlink"/>
@@ -1595,7 +1624,7 @@
         </w:rPr>
         <w:t xml:space="preserve"> a post can be 500 characters. Since September 2025 you can also attach up to 10,000 characters of extra text, which readers open by tapping, as </w:t>
       </w:r>
-      <w:hyperlink w:history="1" r:id="rIdq0xt1c9wp7onhhws2pxgj">
+      <w:hyperlink w:history="1" r:id="rIdfq2lcb1joe8bhzjp8ayzg">
         <w:r>
           <w:rPr>
             <w:rStyle w:val="Hyperlink"/>
@@ -2035,7 +2064,7 @@
           <w:sz w:val="36"/>
           <w:szCs w:val="36"/>
         </w:rPr>
-        <w:t xml:space="preserve">Do emojis, spaces and links count as characters?</w:t>
+        <w:t xml:space="preserve">Do emojis, spaces, links and hashtags count as characters?</w:t>
       </w:r>
     </w:p>
     <w:p>
@@ -2049,7 +2078,7 @@
           <w:sz w:val="24"/>
           <w:szCs w:val="24"/>
         </w:rPr>
-        <w:t xml:space="preserve">Yes, all three count, but not always as one character each.</w:t>
+        <w:t xml:space="preserve">Yes, all of them count, but not always as one character each.</w:t>
       </w:r>
     </w:p>
     <w:p>
@@ -2127,75 +2156,16 @@
           <w:sz w:val="24"/>
           <w:szCs w:val="24"/>
         </w:rPr>
-        <w:t xml:space="preserve">Links</w:t>
-      </w:r>
-      <w:r>
-        <w:rPr>
-          <w:rFonts w:ascii="Calibri" w:cs="Calibri" w:eastAsia="Calibri" w:hAnsi="Calibri"/>
-          <w:color w:val="333333"/>
-          <w:sz w:val="24"/>
-          <w:szCs w:val="24"/>
-        </w:rPr>
-        <w:t xml:space="preserve"> count at their full length on most platforms. X is the exception, counting any link as 23. On Instagram, links in captions aren't clickable, so they cost characters without bringing clicks.</w:t>
-      </w:r>
-    </w:p>
-    <w:p>
-      <w:pPr>
-        <w:spacing w:after="160"/>
-      </w:pPr>
-      <w:r>
-        <w:rPr>
-          <w:rFonts w:ascii="Calibri" w:cs="Calibri" w:eastAsia="Calibri" w:hAnsi="Calibri"/>
-          <w:color w:val="333333"/>
-          <w:sz w:val="24"/>
-          <w:szCs w:val="24"/>
-        </w:rPr>
-        <w:t xml:space="preserve">If your text is close to a limit, paste it into the platform's own post box: its counter is the one that decides.</w:t>
-      </w:r>
-    </w:p>
-    <w:p>
-      <w:pPr>
-        <w:pStyle w:val="Heading2"/>
-        <w:spacing w:after="120" w:before="300"/>
-      </w:pPr>
-      <w:r>
-        <w:rPr>
-          <w:rFonts w:ascii="Calibri" w:cs="Calibri" w:eastAsia="Calibri" w:hAnsi="Calibri"/>
-          <w:b/>
-          <w:bCs/>
-          <w:color w:val="7C3AED"/>
-          <w:sz w:val="36"/>
-          <w:szCs w:val="36"/>
-        </w:rPr>
-        <w:t xml:space="preserve">What happens if your post goes over the limit?</w:t>
-      </w:r>
-    </w:p>
-    <w:p>
-      <w:pPr>
-        <w:spacing w:after="160"/>
-      </w:pPr>
-      <w:r>
-        <w:rPr>
-          <w:rFonts w:ascii="Calibri" w:cs="Calibri" w:eastAsia="Calibri" w:hAnsi="Calibri"/>
-          <w:color w:val="333333"/>
-          <w:sz w:val="24"/>
-          <w:szCs w:val="24"/>
-        </w:rPr>
-        <w:t xml:space="preserve">Usually the platform stops you before you post. X, LinkedIn and Instagram won't publish text that's too long; you have to shorten it first. Scheduling tools typically warn you or fail to publish, which is why TikTok posts sent through them must fit 2,200.</w:t>
-      </w:r>
-    </w:p>
-    <w:p>
-      <w:pPr>
-        <w:spacing w:after="160"/>
-      </w:pPr>
-      <w:r>
-        <w:rPr>
-          <w:rFonts w:ascii="Calibri" w:cs="Calibri" w:eastAsia="Calibri" w:hAnsi="Calibri"/>
-          <w:color w:val="333333"/>
-          <w:sz w:val="24"/>
-          <w:szCs w:val="24"/>
-        </w:rPr>
-        <w:t xml:space="preserve">If you need more space, each platform has a way round it:</w:t>
+        <w:t xml:space="preserve">Hashtags and @mentions</w:t>
+      </w:r>
+      <w:r>
+        <w:rPr>
+          <w:rFonts w:ascii="Calibri" w:cs="Calibri" w:eastAsia="Calibri" w:hAnsi="Calibri"/>
+          <w:color w:val="333333"/>
+          <w:sz w:val="24"/>
+          <w:szCs w:val="24"/>
+        </w:rPr>
+        <w:t xml:space="preserve"> count like any other text, including the # and @ symbols.</w:t>
       </w:r>
     </w:p>
     <w:p>
@@ -2215,16 +2185,75 @@
           <w:sz w:val="24"/>
           <w:szCs w:val="24"/>
         </w:rPr>
-        <w:t xml:space="preserve">X:</w:t>
-      </w:r>
-      <w:r>
-        <w:rPr>
-          <w:rFonts w:ascii="Calibri" w:cs="Calibri" w:eastAsia="Calibri" w:hAnsi="Calibri"/>
-          <w:color w:val="333333"/>
-          <w:sz w:val="24"/>
-          <w:szCs w:val="24"/>
-        </w:rPr>
-        <w:t xml:space="preserve"> split it into a thread, or subscribe to Premium for longer posts.</w:t>
+        <w:t xml:space="preserve">Links</w:t>
+      </w:r>
+      <w:r>
+        <w:rPr>
+          <w:rFonts w:ascii="Calibri" w:cs="Calibri" w:eastAsia="Calibri" w:hAnsi="Calibri"/>
+          <w:color w:val="333333"/>
+          <w:sz w:val="24"/>
+          <w:szCs w:val="24"/>
+        </w:rPr>
+        <w:t xml:space="preserve"> count at their full length on most platforms. X is the exception, counting any link as 23. On Instagram, links in captions aren't clickable, so they cost characters without bringing clicks.</w:t>
+      </w:r>
+    </w:p>
+    <w:p>
+      <w:pPr>
+        <w:spacing w:after="160"/>
+      </w:pPr>
+      <w:r>
+        <w:rPr>
+          <w:rFonts w:ascii="Calibri" w:cs="Calibri" w:eastAsia="Calibri" w:hAnsi="Calibri"/>
+          <w:color w:val="333333"/>
+          <w:sz w:val="24"/>
+          <w:szCs w:val="24"/>
+        </w:rPr>
+        <w:t xml:space="preserve">If your text is close to a limit, paste it into the platform's own post box: its counter is the one that decides.</w:t>
+      </w:r>
+    </w:p>
+    <w:p>
+      <w:pPr>
+        <w:pStyle w:val="Heading2"/>
+        <w:spacing w:after="120" w:before="300"/>
+      </w:pPr>
+      <w:r>
+        <w:rPr>
+          <w:rFonts w:ascii="Calibri" w:cs="Calibri" w:eastAsia="Calibri" w:hAnsi="Calibri"/>
+          <w:b/>
+          <w:bCs/>
+          <w:color w:val="7C3AED"/>
+          <w:sz w:val="36"/>
+          <w:szCs w:val="36"/>
+        </w:rPr>
+        <w:t xml:space="preserve">What happens if your post goes over the limit?</w:t>
+      </w:r>
+    </w:p>
+    <w:p>
+      <w:pPr>
+        <w:spacing w:after="160"/>
+      </w:pPr>
+      <w:r>
+        <w:rPr>
+          <w:rFonts w:ascii="Calibri" w:cs="Calibri" w:eastAsia="Calibri" w:hAnsi="Calibri"/>
+          <w:color w:val="333333"/>
+          <w:sz w:val="24"/>
+          <w:szCs w:val="24"/>
+        </w:rPr>
+        <w:t xml:space="preserve">Usually the platform stops you before you post. X, LinkedIn and Instagram won't publish text that's too long; you have to shorten it first. Scheduling tools typically warn you or fail to publish, which is why TikTok posts sent through them must fit 2,200.</w:t>
+      </w:r>
+    </w:p>
+    <w:p>
+      <w:pPr>
+        <w:spacing w:after="160"/>
+      </w:pPr>
+      <w:r>
+        <w:rPr>
+          <w:rFonts w:ascii="Calibri" w:cs="Calibri" w:eastAsia="Calibri" w:hAnsi="Calibri"/>
+          <w:color w:val="333333"/>
+          <w:sz w:val="24"/>
+          <w:szCs w:val="24"/>
+        </w:rPr>
+        <w:t xml:space="preserve">If you need more space, each platform has a way round it:</w:t>
       </w:r>
     </w:p>
     <w:p>
@@ -2244,16 +2273,16 @@
           <w:sz w:val="24"/>
           <w:szCs w:val="24"/>
         </w:rPr>
-        <w:t xml:space="preserve">LinkedIn:</w:t>
-      </w:r>
-      <w:r>
-        <w:rPr>
-          <w:rFonts w:ascii="Calibri" w:cs="Calibri" w:eastAsia="Calibri" w:hAnsi="Calibri"/>
-          <w:color w:val="333333"/>
-          <w:sz w:val="24"/>
-          <w:szCs w:val="24"/>
-        </w:rPr>
-        <w:t xml:space="preserve"> publish an article and share it as a post.</w:t>
+        <w:t xml:space="preserve">X:</w:t>
+      </w:r>
+      <w:r>
+        <w:rPr>
+          <w:rFonts w:ascii="Calibri" w:cs="Calibri" w:eastAsia="Calibri" w:hAnsi="Calibri"/>
+          <w:color w:val="333333"/>
+          <w:sz w:val="24"/>
+          <w:szCs w:val="24"/>
+        </w:rPr>
+        <w:t xml:space="preserve"> split it into a thread, or subscribe to Premium for longer posts.</w:t>
       </w:r>
     </w:p>
     <w:p>
@@ -2273,16 +2302,16 @@
           <w:sz w:val="24"/>
           <w:szCs w:val="24"/>
         </w:rPr>
-        <w:t xml:space="preserve">Threads:</w:t>
-      </w:r>
-      <w:r>
-        <w:rPr>
-          <w:rFonts w:ascii="Calibri" w:cs="Calibri" w:eastAsia="Calibri" w:hAnsi="Calibri"/>
-          <w:color w:val="333333"/>
-          <w:sz w:val="24"/>
-          <w:szCs w:val="24"/>
-        </w:rPr>
-        <w:t xml:space="preserve"> use a text attachment.</w:t>
+        <w:t xml:space="preserve">LinkedIn:</w:t>
+      </w:r>
+      <w:r>
+        <w:rPr>
+          <w:rFonts w:ascii="Calibri" w:cs="Calibri" w:eastAsia="Calibri" w:hAnsi="Calibri"/>
+          <w:color w:val="333333"/>
+          <w:sz w:val="24"/>
+          <w:szCs w:val="24"/>
+        </w:rPr>
+        <w:t xml:space="preserve"> publish an article and share it as a post.</w:t>
       </w:r>
     </w:p>
     <w:p>
@@ -2302,6 +2331,35 @@
           <w:sz w:val="24"/>
           <w:szCs w:val="24"/>
         </w:rPr>
+        <w:t xml:space="preserve">Threads:</w:t>
+      </w:r>
+      <w:r>
+        <w:rPr>
+          <w:rFonts w:ascii="Calibri" w:cs="Calibri" w:eastAsia="Calibri" w:hAnsi="Calibri"/>
+          <w:color w:val="333333"/>
+          <w:sz w:val="24"/>
+          <w:szCs w:val="24"/>
+        </w:rPr>
+        <w:t xml:space="preserve"> use a text attachment.</w:t>
+      </w:r>
+    </w:p>
+    <w:p>
+      <w:pPr>
+        <w:pStyle w:val="ListParagraph"/>
+        <w:numPr>
+          <w:ilvl w:val="0"/>
+          <w:numId w:val="1"/>
+        </w:numPr>
+      </w:pPr>
+      <w:r>
+        <w:rPr>
+          <w:rFonts w:ascii="Calibri" w:cs="Calibri" w:eastAsia="Calibri" w:hAnsi="Calibri"/>
+          <w:b/>
+          <w:bCs/>
+          <w:color w:val="333333"/>
+          <w:sz w:val="24"/>
+          <w:szCs w:val="24"/>
+        </w:rPr>
         <w:t xml:space="preserve">Instagram:</w:t>
       </w:r>
       <w:r>
@@ -2407,7 +2465,7 @@
           <w:sz w:val="28"/>
           <w:szCs w:val="28"/>
         </w:rPr>
-        <w:t xml:space="preserve">Do hashtags and @mentions count towards the limit?</w:t>
+        <w:t xml:space="preserve">Do photos and videos use up characters?</w:t>
       </w:r>
     </w:p>
     <w:p>
@@ -2421,7 +2479,7 @@
           <w:sz w:val="24"/>
           <w:szCs w:val="24"/>
         </w:rPr>
-        <w:t xml:space="preserve">Yes. Hashtags and @mentions are part of the text, so every character in them counts, including the # and @ symbols.</w:t>
+        <w:t xml:space="preserve">No. On X, media attached through the official apps counts as zero characters, according to X's documentation, and on other platforms images and videos sit outside the caption entirely. Only the text you type, including any link to the media, counts.</w:t>
       </w:r>
     </w:p>
     <w:p>

</xml_diff>